<commit_message>
Put the ΟΚΥπΥ logo and the official palette on the manual
The Word manual now follows the house style rather than the app's screen
colours: logo at the head of the title page, bright-blue rule under the title,
deep blue headings and table headers, light-grey zebra rows, grey body text,
and the full-width bright-blue accent bar in the footer with the organisation
name left and the page number right. Callouts carry the brand green.

The logo files live in docs/assets/ so the document can be rebuilt from the
repository alone.

Co-Authored-By: Claude Opus 5 <noreply@anthropic.com>
Claude-Session: https://claude.ai/code/session_011MqasjYJgewtxKsgxp7Q1P
</commit_message>
<xml_diff>
--- a/docs/ΟΚΥπΥ_Συμφωνία_ΟΑΥ_Οδηγίες_Χρήσης.docx
+++ b/docs/ΟΚΥπΥ_Συμφωνία_ΟΑΥ_Οδηγίες_Χρήσης.docx
@@ -4,71 +4,114 @@
   <w:body>
     <w:p>
       <w:pPr>
-        <w:spacing w:after="60"/>
+        <w:spacing w:after="220"/>
+      </w:pPr>
+      <w:r>
+        <w:drawing>
+          <wp:inline distT="0" distB="0" distL="0" distR="0">
+            <wp:extent cx="1866900" cy="1162050"/>
+            <wp:effectExtent t="0" r="0" b="0" l="0"/>
+            <wp:docPr id="1" name="" descr="" title=""/>
+            <wp:cNvGraphicFramePr>
+              <a:graphicFrameLocks xmlns:a="http://schemas.openxmlformats.org/drawingml/2006/main" noChangeAspect="1"/>
+            </wp:cNvGraphicFramePr>
+            <a:graphic xmlns:a="http://schemas.openxmlformats.org/drawingml/2006/main">
+              <a:graphicData uri="http://schemas.openxmlformats.org/drawingml/2006/picture">
+                <pic:pic xmlns:pic="http://schemas.openxmlformats.org/drawingml/2006/picture">
+                  <pic:nvPicPr>
+                    <pic:cNvPr id="0" name="" descr=""/>
+                    <pic:cNvPicPr>
+                      <a:picLocks noChangeAspect="1" noChangeArrowheads="1"/>
+                    </pic:cNvPicPr>
+                  </pic:nvPicPr>
+                  <pic:blipFill>
+                    <a:blip r:embed="rId8" cstate="none"/>
+                    <a:srcRect/>
+                    <a:stretch>
+                      <a:fillRect/>
+                    </a:stretch>
+                  </pic:blipFill>
+                  <pic:spPr bwMode="auto">
+                    <a:xfrm>
+                      <a:off x="0" y="0"/>
+                      <a:ext cx="1866900" cy="1162050"/>
+                    </a:xfrm>
+                    <a:prstGeom prst="rect">
+                      <a:avLst/>
+                    </a:prstGeom>
+                  </pic:spPr>
+                </pic:pic>
+              </a:graphicData>
+            </a:graphic>
+          </wp:inline>
+        </w:drawing>
+      </w:r>
+    </w:p>
+    <w:p>
+      <w:pPr>
+        <w:pBdr>
+          <w:bottom w:val="single" w:color="069FEC" w:sz="18" w:space="8"/>
+        </w:pBdr>
+        <w:spacing w:after="100"/>
       </w:pPr>
       <w:r>
         <w:rPr>
           <w:b/>
           <w:bCs/>
-          <w:color w:val="0072BC"/>
-          <w:sz w:val="20"/>
-          <w:szCs w:val="20"/>
-        </w:rPr>
-        <w:t xml:space="preserve">ΟΚΥπΥ — Οργανισμός Κρατικών Υπηρεσιών Υγείας</w:t>
-      </w:r>
-    </w:p>
-    <w:p>
-      <w:pPr>
-        <w:pBdr>
-          <w:bottom w:val="single" w:color="062E5C" w:sz="12" w:space="6"/>
-        </w:pBdr>
-        <w:spacing w:after="80"/>
+          <w:color w:val="1B75BB"/>
+          <w:sz w:val="40"/>
+          <w:szCs w:val="40"/>
+        </w:rPr>
+        <w:t xml:space="preserve">Συμφωνία Πληρωμών ΟΑΥ — Οδηγίες χρήσης</w:t>
+      </w:r>
+    </w:p>
+    <w:p>
+      <w:pPr>
+        <w:spacing w:after="140" w:line="276"/>
+      </w:pPr>
+      <w:r>
+        <w:rPr>
+          <w:color w:val="58595B"/>
+        </w:rPr>
+        <w:t xml:space="preserve">Μηνιαία συμφωνία των πληρωμών του Οργανισμού Ασφάλισης Υγείας (ΟΑΥ) ανά νοσοκομείο και ετοιμασία των λογιστικών εγγραφών για το SAP.</w:t>
+      </w:r>
+    </w:p>
+    <w:p>
+      <w:pPr>
+        <w:spacing w:after="140" w:line="276"/>
+      </w:pPr>
+      <w:r>
+        <w:rPr>
+          <w:color w:val="58595B"/>
+          <w:sz w:val="18"/>
+          <w:szCs w:val="18"/>
+        </w:rPr>
+        <w:t xml:space="preserve">Οργανισμός Κρατικών Υπηρεσιών Υγείας (ΟΚΥπΥ) · State Health Services Organisation (SHSO)</w:t>
+      </w:r>
+    </w:p>
+    <w:p>
+      <w:pPr>
+        <w:spacing w:after="320" w:line="276"/>
+      </w:pPr>
+      <w:r>
+        <w:rPr>
+          <w:color w:val="58595B"/>
+          <w:sz w:val="18"/>
+          <w:szCs w:val="18"/>
+        </w:rPr>
+        <w:t xml:space="preserve">Διεύθυνση Οικονομικών Υπηρεσιών · Έκδοση 17/09/2026 · Εσωτερικό έγγραφο</w:t>
+      </w:r>
+    </w:p>
+    <w:p>
+      <w:pPr>
+        <w:pStyle w:val="Heading1"/>
+        <w:spacing w:after="160" w:before="320"/>
       </w:pPr>
       <w:r>
         <w:rPr>
           <w:b/>
           <w:bCs/>
-          <w:color w:val="062E5C"/>
-          <w:sz w:val="40"/>
-          <w:szCs w:val="40"/>
-        </w:rPr>
-        <w:t xml:space="preserve">Συμφωνία Πληρωμών ΟΑΥ — Οδηγίες χρήσης</w:t>
-      </w:r>
-    </w:p>
-    <w:p>
-      <w:pPr>
-        <w:spacing w:after="140" w:line="276"/>
-      </w:pPr>
-      <w:r>
-        <w:rPr>
-          <w:color w:val="595959"/>
-        </w:rPr>
-        <w:t xml:space="preserve">Μηνιαία συμφωνία των πληρωμών του Οργανισμού Ασφάλισης Υγείας (ΟΑΥ) ανά νοσοκομείο και ετοιμασία των λογιστικών εγγραφών για το SAP.</w:t>
-      </w:r>
-    </w:p>
-    <w:p>
-      <w:pPr>
-        <w:spacing w:after="300" w:line="276"/>
-      </w:pPr>
-      <w:r>
-        <w:rPr>
-          <w:color w:val="595959"/>
-          <w:sz w:val="18"/>
-          <w:szCs w:val="18"/>
-        </w:rPr>
-        <w:t xml:space="preserve">Έκδοση Σεπτεμβρίου 2026 · Εσωτερικό εργαλείο Διεύθυνσης Οικονομικών Υπηρεσιών</w:t>
-      </w:r>
-    </w:p>
-    <w:p>
-      <w:pPr>
-        <w:pStyle w:val="Heading1"/>
-        <w:spacing w:after="160" w:before="320"/>
-      </w:pPr>
-      <w:r>
-        <w:rPr>
-          <w:b/>
-          <w:bCs/>
-          <w:color w:val="062E5C"/>
+          <w:color w:val="1B75BB"/>
           <w:sz w:val="30"/>
           <w:szCs w:val="30"/>
         </w:rPr>
@@ -80,6 +123,9 @@
         <w:spacing w:after="140" w:line="276"/>
       </w:pPr>
       <w:r>
+        <w:rPr>
+          <w:color w:val="58595B"/>
+        </w:rPr>
         <w:t xml:space="preserve">Διαβάζει τις μηνιαίες αναφορές που εκδίδει ο ΟΑΥ για ένα νοσοκομείο, τις δένει μεταξύ τους και με την επιταγή, και σας δίνει δύο αρχεία.</w:t>
       </w:r>
     </w:p>
@@ -93,6 +139,9 @@
         <w:spacing w:after="80" w:line="276"/>
       </w:pPr>
       <w:r>
+        <w:rPr>
+          <w:color w:val="58595B"/>
+        </w:rPr>
         <w:t xml:space="preserve">Το βιβλίο συμφωνίας, με την ανάλυση της επιταγής, τους τέσσερις κάδους του ταμειακού διακανονισμού, τις διασταυρώσεις με τις πηγές και τον επιμερισμό των εσόδων ανά κλινική.</w:t>
       </w:r>
     </w:p>
@@ -106,6 +155,9 @@
         <w:spacing w:after="80" w:line="276"/>
       </w:pPr>
       <w:r>
+        <w:rPr>
+          <w:color w:val="58595B"/>
+        </w:rPr>
         <w:t xml:space="preserve">Το αρχείο εγγραφών SAP, στη διάταξη που ανεβάζει το Λογιστήριο, με εταιρεία, λογαριασμό εσόδων και κέντρο κόστους συμπληρωμένα.</w:t>
       </w:r>
     </w:p>
@@ -114,6 +166,9 @@
         <w:spacing w:after="140" w:line="276"/>
       </w:pPr>
       <w:r>
+        <w:rPr>
+          <w:color w:val="58595B"/>
+        </w:rPr>
         <w:t xml:space="preserve">Τρέχει ολόκληρο μέσα στον browser σας. Κανένα αρχείο δεν φεύγει από τον υπολογιστή, τίποτα δεν αποθηκεύεται, και μόλις κλείσετε τη σελίδα δεν μένει τίποτα πίσω. Δεν υπάρχει βάση δεδομένων ούτε σύνδεση χρήστη.</w:t>
       </w:r>
     </w:p>
@@ -126,7 +181,7 @@
         <w:rPr>
           <w:b/>
           <w:bCs/>
-          <w:color w:val="062E5C"/>
+          <w:color w:val="1B75BB"/>
           <w:sz w:val="30"/>
           <w:szCs w:val="30"/>
         </w:rPr>
@@ -143,6 +198,9 @@
         <w:spacing w:after="80" w:line="276"/>
       </w:pPr>
       <w:r>
+        <w:rPr>
+          <w:color w:val="58595B"/>
+        </w:rPr>
         <w:t xml:space="preserve">Ανοίξτε το okypy-recon.html με διπλό κλικ. Δεν χρειάζεται εγκατάσταση.</w:t>
       </w:r>
     </w:p>
@@ -156,6 +214,9 @@
         <w:spacing w:after="80" w:line="276"/>
       </w:pPr>
       <w:r>
+        <w:rPr>
+          <w:color w:val="58595B"/>
+        </w:rPr>
         <w:t xml:space="preserve">Σύρετε στο πλαίσιο όλα τα αρχεία ενός νοσοκομείου για έναν μήνα.</w:t>
       </w:r>
     </w:p>
@@ -169,6 +230,9 @@
         <w:spacing w:after="80" w:line="276"/>
       </w:pPr>
       <w:r>
+        <w:rPr>
+          <w:color w:val="58595B"/>
+        </w:rPr>
         <w:t xml:space="preserve">Δείτε τον πίνακα αναγνώρισης: κάθε αρχείο πρέπει να δείχνει είδος αναφοράς, νοσοκομείο και μήνα. Ό,τι δεν αναγνωριστεί βγάζει προειδοποίηση και μένει εκτός.</w:t>
       </w:r>
     </w:p>
@@ -182,6 +246,9 @@
         <w:spacing w:after="80" w:line="276"/>
       </w:pPr>
       <w:r>
+        <w:rPr>
+          <w:color w:val="58595B"/>
+        </w:rPr>
         <w:t xml:space="preserve">Πατήστε «Εκτέλεση συμφωνίας». Το κουμπί ενεργοποιείται μόλις συμπληρωθεί το απαραίτητο σετ.</w:t>
       </w:r>
     </w:p>
@@ -195,6 +262,9 @@
         <w:spacing w:after="80" w:line="276"/>
       </w:pPr>
       <w:r>
+        <w:rPr>
+          <w:color w:val="58595B"/>
+        </w:rPr>
         <w:t xml:space="preserve">Διαβάστε τη σύνοψη στην οθόνη: σύνολο επιταγής, οι τέσσερις κάδοι, τα κελιά ελέγχου, οι ανοικτές διαφορές.</w:t>
       </w:r>
     </w:p>
@@ -208,6 +278,9 @@
         <w:spacing w:after="80" w:line="276"/>
       </w:pPr>
       <w:r>
+        <w:rPr>
+          <w:color w:val="58595B"/>
+        </w:rPr>
         <w:t xml:space="preserve">Κατεβάστε το βιβλίο συμφωνίας και, όταν υπάρχει επιταγή, το αρχείο SAP.</w:t>
       </w:r>
     </w:p>
@@ -216,6 +289,9 @@
         <w:spacing w:after="140" w:line="276"/>
       </w:pPr>
       <w:r>
+        <w:rPr>
+          <w:color w:val="58595B"/>
+        </w:rPr>
         <w:t xml:space="preserve">Ένα νοσοκομείο και ένας μήνας κάθε φορά. Αν στην παρτίδα μπερδευτούν δύο νοσοκομεία ή δύο μήνες, η εκτέλεση σταματά με σαφές μήνυμα.</w:t>
       </w:r>
     </w:p>
@@ -224,6 +300,9 @@
         <w:spacing w:after="140" w:line="276"/>
       </w:pPr>
       <w:r>
+        <w:rPr>
+          <w:color w:val="58595B"/>
+        </w:rPr>
         <w:t xml:space="preserve">Η επιταγή φέρει πάντα ημερομηνία του επόμενου μήνα, γιατί ο ΟΑΥ πληρώνει με καθυστέρηση· ο μήνας υπηρεσιών βγαίνει μόνος του, ημερομηνία μείον έναν μήνα.</w:t>
       </w:r>
     </w:p>
@@ -236,7 +315,7 @@
         <w:rPr>
           <w:b/>
           <w:bCs/>
-          <w:color w:val="062E5C"/>
+          <w:color w:val="1B75BB"/>
           <w:sz w:val="30"/>
           <w:szCs w:val="30"/>
         </w:rPr>
@@ -252,7 +331,7 @@
         <w:rPr>
           <w:b/>
           <w:bCs/>
-          <w:color w:val="0072BC"/>
+          <w:color w:val="069FEC"/>
           <w:sz w:val="24"/>
           <w:szCs w:val="24"/>
         </w:rPr>
@@ -284,7 +363,7 @@
         <w:tc>
           <w:tcPr>
             <w:tcW w:type="dxa" w:w="620"/>
-            <w:shd w:fill="062E5C" w:val="clear"/>
+            <w:shd w:fill="1B75BB" w:val="clear"/>
             <w:tcMar>
               <w:top w:type="dxa" w:w="60"/>
               <w:left w:type="dxa" w:w="100"/>
@@ -311,7 +390,7 @@
         <w:tc>
           <w:tcPr>
             <w:tcW w:type="dxa" w:w="4700"/>
-            <w:shd w:fill="062E5C" w:val="clear"/>
+            <w:shd w:fill="1B75BB" w:val="clear"/>
             <w:tcMar>
               <w:top w:type="dxa" w:w="60"/>
               <w:left w:type="dxa" w:w="100"/>
@@ -338,7 +417,7 @@
         <w:tc>
           <w:tcPr>
             <w:tcW w:type="dxa" w:w="1500"/>
-            <w:shd w:fill="062E5C" w:val="clear"/>
+            <w:shd w:fill="1B75BB" w:val="clear"/>
             <w:tcMar>
               <w:top w:type="dxa" w:w="60"/>
               <w:left w:type="dxa" w:w="100"/>
@@ -365,7 +444,7 @@
         <w:tc>
           <w:tcPr>
             <w:tcW w:type="dxa" w:w="2206"/>
-            <w:shd w:fill="062E5C" w:val="clear"/>
+            <w:shd w:fill="1B75BB" w:val="clear"/>
             <w:tcMar>
               <w:top w:type="dxa" w:w="60"/>
               <w:left w:type="dxa" w:w="100"/>
@@ -407,6 +486,7 @@
             </w:pPr>
             <w:r>
               <w:rPr>
+                <w:color w:val="58595B"/>
                 <w:sz w:val="19"/>
                 <w:szCs w:val="19"/>
               </w:rPr>
@@ -430,6 +510,7 @@
             </w:pPr>
             <w:r>
               <w:rPr>
+                <w:color w:val="58595B"/>
                 <w:sz w:val="19"/>
                 <w:szCs w:val="19"/>
               </w:rPr>
@@ -453,6 +534,7 @@
             </w:pPr>
             <w:r>
               <w:rPr>
+                <w:color w:val="58595B"/>
                 <w:sz w:val="19"/>
                 <w:szCs w:val="19"/>
               </w:rPr>
@@ -476,6 +558,7 @@
             </w:pPr>
             <w:r>
               <w:rPr>
+                <w:color w:val="58595B"/>
                 <w:sz w:val="19"/>
                 <w:szCs w:val="19"/>
               </w:rPr>
@@ -488,19 +571,21 @@
         <w:tc>
           <w:tcPr>
             <w:tcW w:type="dxa" w:w="620"/>
-            <w:tcMar>
-              <w:top w:type="dxa" w:w="60"/>
-              <w:left w:type="dxa" w:w="100"/>
-              <w:bottom w:type="dxa" w:w="60"/>
-              <w:right w:type="dxa" w:w="100"/>
-            </w:tcMar>
-          </w:tcPr>
-          <w:p>
-            <w:pPr>
-              <w:spacing w:after="0" w:line="252"/>
-            </w:pPr>
-            <w:r>
-              <w:rPr>
+            <w:shd w:fill="EAEAEA" w:val="clear"/>
+            <w:tcMar>
+              <w:top w:type="dxa" w:w="60"/>
+              <w:left w:type="dxa" w:w="100"/>
+              <w:bottom w:type="dxa" w:w="60"/>
+              <w:right w:type="dxa" w:w="100"/>
+            </w:tcMar>
+          </w:tcPr>
+          <w:p>
+            <w:pPr>
+              <w:spacing w:after="0" w:line="252"/>
+            </w:pPr>
+            <w:r>
+              <w:rPr>
+                <w:color w:val="58595B"/>
                 <w:sz w:val="19"/>
                 <w:szCs w:val="19"/>
               </w:rPr>
@@ -511,19 +596,21 @@
         <w:tc>
           <w:tcPr>
             <w:tcW w:type="dxa" w:w="4700"/>
-            <w:tcMar>
-              <w:top w:type="dxa" w:w="60"/>
-              <w:left w:type="dxa" w:w="100"/>
-              <w:bottom w:type="dxa" w:w="60"/>
-              <w:right w:type="dxa" w:w="100"/>
-            </w:tcMar>
-          </w:tcPr>
-          <w:p>
-            <w:pPr>
-              <w:spacing w:after="0" w:line="252"/>
-            </w:pPr>
-            <w:r>
-              <w:rPr>
+            <w:shd w:fill="EAEAEA" w:val="clear"/>
+            <w:tcMar>
+              <w:top w:type="dxa" w:w="60"/>
+              <w:left w:type="dxa" w:w="100"/>
+              <w:bottom w:type="dxa" w:w="60"/>
+              <w:right w:type="dxa" w:w="100"/>
+            </w:tcMar>
+          </w:tcPr>
+          <w:p>
+            <w:pPr>
+              <w:spacing w:after="0" w:line="252"/>
+            </w:pPr>
+            <w:r>
+              <w:rPr>
+                <w:color w:val="58595B"/>
                 <w:sz w:val="19"/>
                 <w:szCs w:val="19"/>
               </w:rPr>
@@ -534,19 +621,21 @@
         <w:tc>
           <w:tcPr>
             <w:tcW w:type="dxa" w:w="1500"/>
-            <w:tcMar>
-              <w:top w:type="dxa" w:w="60"/>
-              <w:left w:type="dxa" w:w="100"/>
-              <w:bottom w:type="dxa" w:w="60"/>
-              <w:right w:type="dxa" w:w="100"/>
-            </w:tcMar>
-          </w:tcPr>
-          <w:p>
-            <w:pPr>
-              <w:spacing w:after="0" w:line="252"/>
-            </w:pPr>
-            <w:r>
-              <w:rPr>
+            <w:shd w:fill="EAEAEA" w:val="clear"/>
+            <w:tcMar>
+              <w:top w:type="dxa" w:w="60"/>
+              <w:left w:type="dxa" w:w="100"/>
+              <w:bottom w:type="dxa" w:w="60"/>
+              <w:right w:type="dxa" w:w="100"/>
+            </w:tcMar>
+          </w:tcPr>
+          <w:p>
+            <w:pPr>
+              <w:spacing w:after="0" w:line="252"/>
+            </w:pPr>
+            <w:r>
+              <w:rPr>
+                <w:color w:val="58595B"/>
                 <w:sz w:val="19"/>
                 <w:szCs w:val="19"/>
               </w:rPr>
@@ -557,19 +646,21 @@
         <w:tc>
           <w:tcPr>
             <w:tcW w:type="dxa" w:w="2206"/>
-            <w:tcMar>
-              <w:top w:type="dxa" w:w="60"/>
-              <w:left w:type="dxa" w:w="100"/>
-              <w:bottom w:type="dxa" w:w="60"/>
-              <w:right w:type="dxa" w:w="100"/>
-            </w:tcMar>
-          </w:tcPr>
-          <w:p>
-            <w:pPr>
-              <w:spacing w:after="0" w:line="252"/>
-            </w:pPr>
-            <w:r>
-              <w:rPr>
+            <w:shd w:fill="EAEAEA" w:val="clear"/>
+            <w:tcMar>
+              <w:top w:type="dxa" w:w="60"/>
+              <w:left w:type="dxa" w:w="100"/>
+              <w:bottom w:type="dxa" w:w="60"/>
+              <w:right w:type="dxa" w:w="100"/>
+            </w:tcMar>
+          </w:tcPr>
+          <w:p>
+            <w:pPr>
+              <w:spacing w:after="0" w:line="252"/>
+            </w:pPr>
+            <w:r>
+              <w:rPr>
+                <w:color w:val="58595B"/>
                 <w:sz w:val="19"/>
                 <w:szCs w:val="19"/>
               </w:rPr>
@@ -595,6 +686,7 @@
             </w:pPr>
             <w:r>
               <w:rPr>
+                <w:color w:val="58595B"/>
                 <w:sz w:val="19"/>
                 <w:szCs w:val="19"/>
               </w:rPr>
@@ -618,6 +710,7 @@
             </w:pPr>
             <w:r>
               <w:rPr>
+                <w:color w:val="58595B"/>
                 <w:sz w:val="19"/>
                 <w:szCs w:val="19"/>
               </w:rPr>
@@ -641,6 +734,7 @@
             </w:pPr>
             <w:r>
               <w:rPr>
+                <w:color w:val="58595B"/>
                 <w:sz w:val="19"/>
                 <w:szCs w:val="19"/>
               </w:rPr>
@@ -664,6 +758,7 @@
             </w:pPr>
             <w:r>
               <w:rPr>
+                <w:color w:val="58595B"/>
                 <w:sz w:val="19"/>
                 <w:szCs w:val="19"/>
               </w:rPr>
@@ -676,19 +771,21 @@
         <w:tc>
           <w:tcPr>
             <w:tcW w:type="dxa" w:w="620"/>
-            <w:tcMar>
-              <w:top w:type="dxa" w:w="60"/>
-              <w:left w:type="dxa" w:w="100"/>
-              <w:bottom w:type="dxa" w:w="60"/>
-              <w:right w:type="dxa" w:w="100"/>
-            </w:tcMar>
-          </w:tcPr>
-          <w:p>
-            <w:pPr>
-              <w:spacing w:after="0" w:line="252"/>
-            </w:pPr>
-            <w:r>
-              <w:rPr>
+            <w:shd w:fill="EAEAEA" w:val="clear"/>
+            <w:tcMar>
+              <w:top w:type="dxa" w:w="60"/>
+              <w:left w:type="dxa" w:w="100"/>
+              <w:bottom w:type="dxa" w:w="60"/>
+              <w:right w:type="dxa" w:w="100"/>
+            </w:tcMar>
+          </w:tcPr>
+          <w:p>
+            <w:pPr>
+              <w:spacing w:after="0" w:line="252"/>
+            </w:pPr>
+            <w:r>
+              <w:rPr>
+                <w:color w:val="58595B"/>
                 <w:sz w:val="19"/>
                 <w:szCs w:val="19"/>
               </w:rPr>
@@ -699,19 +796,21 @@
         <w:tc>
           <w:tcPr>
             <w:tcW w:type="dxa" w:w="4700"/>
-            <w:tcMar>
-              <w:top w:type="dxa" w:w="60"/>
-              <w:left w:type="dxa" w:w="100"/>
-              <w:bottom w:type="dxa" w:w="60"/>
-              <w:right w:type="dxa" w:w="100"/>
-            </w:tcMar>
-          </w:tcPr>
-          <w:p>
-            <w:pPr>
-              <w:spacing w:after="0" w:line="252"/>
-            </w:pPr>
-            <w:r>
-              <w:rPr>
+            <w:shd w:fill="EAEAEA" w:val="clear"/>
+            <w:tcMar>
+              <w:top w:type="dxa" w:w="60"/>
+              <w:left w:type="dxa" w:w="100"/>
+              <w:bottom w:type="dxa" w:w="60"/>
+              <w:right w:type="dxa" w:w="100"/>
+            </w:tcMar>
+          </w:tcPr>
+          <w:p>
+            <w:pPr>
+              <w:spacing w:after="0" w:line="252"/>
+            </w:pPr>
+            <w:r>
+              <w:rPr>
+                <w:color w:val="58595B"/>
                 <w:sz w:val="19"/>
                 <w:szCs w:val="19"/>
               </w:rPr>
@@ -722,19 +821,21 @@
         <w:tc>
           <w:tcPr>
             <w:tcW w:type="dxa" w:w="1500"/>
-            <w:tcMar>
-              <w:top w:type="dxa" w:w="60"/>
-              <w:left w:type="dxa" w:w="100"/>
-              <w:bottom w:type="dxa" w:w="60"/>
-              <w:right w:type="dxa" w:w="100"/>
-            </w:tcMar>
-          </w:tcPr>
-          <w:p>
-            <w:pPr>
-              <w:spacing w:after="0" w:line="252"/>
-            </w:pPr>
-            <w:r>
-              <w:rPr>
+            <w:shd w:fill="EAEAEA" w:val="clear"/>
+            <w:tcMar>
+              <w:top w:type="dxa" w:w="60"/>
+              <w:left w:type="dxa" w:w="100"/>
+              <w:bottom w:type="dxa" w:w="60"/>
+              <w:right w:type="dxa" w:w="100"/>
+            </w:tcMar>
+          </w:tcPr>
+          <w:p>
+            <w:pPr>
+              <w:spacing w:after="0" w:line="252"/>
+            </w:pPr>
+            <w:r>
+              <w:rPr>
+                <w:color w:val="58595B"/>
                 <w:sz w:val="19"/>
                 <w:szCs w:val="19"/>
               </w:rPr>
@@ -745,19 +846,21 @@
         <w:tc>
           <w:tcPr>
             <w:tcW w:type="dxa" w:w="2206"/>
-            <w:tcMar>
-              <w:top w:type="dxa" w:w="60"/>
-              <w:left w:type="dxa" w:w="100"/>
-              <w:bottom w:type="dxa" w:w="60"/>
-              <w:right w:type="dxa" w:w="100"/>
-            </w:tcMar>
-          </w:tcPr>
-          <w:p>
-            <w:pPr>
-              <w:spacing w:after="0" w:line="252"/>
-            </w:pPr>
-            <w:r>
-              <w:rPr>
+            <w:shd w:fill="EAEAEA" w:val="clear"/>
+            <w:tcMar>
+              <w:top w:type="dxa" w:w="60"/>
+              <w:left w:type="dxa" w:w="100"/>
+              <w:bottom w:type="dxa" w:w="60"/>
+              <w:right w:type="dxa" w:w="100"/>
+            </w:tcMar>
+          </w:tcPr>
+          <w:p>
+            <w:pPr>
+              <w:spacing w:after="0" w:line="252"/>
+            </w:pPr>
+            <w:r>
+              <w:rPr>
+                <w:color w:val="58595B"/>
                 <w:sz w:val="19"/>
                 <w:szCs w:val="19"/>
               </w:rPr>
@@ -783,6 +886,7 @@
             </w:pPr>
             <w:r>
               <w:rPr>
+                <w:color w:val="58595B"/>
                 <w:sz w:val="19"/>
                 <w:szCs w:val="19"/>
               </w:rPr>
@@ -806,6 +910,7 @@
             </w:pPr>
             <w:r>
               <w:rPr>
+                <w:color w:val="58595B"/>
                 <w:sz w:val="19"/>
                 <w:szCs w:val="19"/>
               </w:rPr>
@@ -829,6 +934,7 @@
             </w:pPr>
             <w:r>
               <w:rPr>
+                <w:color w:val="58595B"/>
                 <w:sz w:val="19"/>
                 <w:szCs w:val="19"/>
               </w:rPr>
@@ -852,6 +958,7 @@
             </w:pPr>
             <w:r>
               <w:rPr>
+                <w:color w:val="58595B"/>
                 <w:sz w:val="19"/>
                 <w:szCs w:val="19"/>
               </w:rPr>
@@ -866,6 +973,9 @@
         <w:spacing w:after="80" w:line="276"/>
       </w:pPr>
       <w:r>
+        <w:rPr>
+          <w:color w:val="58595B"/>
+        </w:rPr>
         <w:t xml:space="preserve"/>
       </w:r>
     </w:p>
@@ -878,7 +988,7 @@
         <w:rPr>
           <w:b/>
           <w:bCs/>
-          <w:color w:val="0072BC"/>
+          <w:color w:val="069FEC"/>
           <w:sz w:val="24"/>
           <w:szCs w:val="24"/>
         </w:rPr>
@@ -890,6 +1000,9 @@
         <w:spacing w:after="140" w:line="276"/>
       </w:pPr>
       <w:r>
+        <w:rPr>
+          <w:color w:val="58595B"/>
+        </w:rPr>
         <w:t xml:space="preserve">Χρειάζονται μόνο όταν η επιταγή έχει αντίστοιχη γραμμή: η αναφορά κατά κεφαλήν αμοιβής (capitation), τα Ποιοτικά Κριτήρια μαζί με τις γραμμές MRI και CT, και η μηνιαία αναφορά αιμοκάθαρσης.</w:t>
       </w:r>
     </w:p>
@@ -902,7 +1015,7 @@
         <w:rPr>
           <w:b/>
           <w:bCs/>
-          <w:color w:val="0072BC"/>
+          <w:color w:val="069FEC"/>
           <w:sz w:val="24"/>
           <w:szCs w:val="24"/>
         </w:rPr>
@@ -914,14 +1027,18 @@
         <w:spacing w:after="140" w:line="276"/>
       </w:pPr>
       <w:r>
+        <w:rPr>
+          <w:color w:val="58595B"/>
+        </w:rPr>
         <w:t xml:space="preserve">Το XML activity export, το OKYPY ALL GL extract και το IS Auditor Report δεν μπλοκάρουν ποτέ την εκτέλεση. Όποιο ανεβεί, προσθέτει μία ακόμα διασταύρωση στο βιβλίο.</w:t>
       </w:r>
     </w:p>
     <w:p>
       <w:pPr>
         <w:pBdr>
-          <w:left w:val="single" w:color="B45F06" w:sz="18" w:space="8"/>
+          <w:left w:val="single" w:color="8BC53F" w:sz="18" w:space="8"/>
         </w:pBdr>
+        <w:shd w:fill="F4F9EC" w:val="clear"/>
         <w:spacing w:after="160" w:before="140" w:line="276"/>
         <w:ind w:left="200"/>
       </w:pPr>
@@ -929,7 +1046,7 @@
         <w:rPr>
           <w:i/>
           <w:iCs/>
-          <w:color w:val="6B4A10"/>
+          <w:color w:val="58595B"/>
         </w:rPr>
         <w:t xml:space="preserve">Η αναγνώριση γίνεται από το περιεχόμενο, όχι από το όνομα του αρχείου. Καλό αυτό, γιατί ο ΟΑΥ βαφτίζει «..._OS_...» το αρχείο που κρατά όλα τα segments.</w:t>
       </w:r>
@@ -939,6 +1056,9 @@
         <w:spacing w:after="140" w:line="276"/>
       </w:pPr>
       <w:r>
+        <w:rPr>
+          <w:color w:val="58595B"/>
+        </w:rPr>
         <w:t xml:space="preserve">Αν το PDF της επιταγής είναι σκαναρισμένο και δεν διαβάζεται, ανοίξτε τη «Χειροκίνητη επιλογή» και επικολλήστε το κείμενο. Το εργαλείο δεν μαντεύει ποσά σε καμία περίπτωση.</w:t>
       </w:r>
     </w:p>
@@ -951,7 +1071,7 @@
         <w:rPr>
           <w:b/>
           <w:bCs/>
-          <w:color w:val="062E5C"/>
+          <w:color w:val="1B75BB"/>
           <w:sz w:val="30"/>
           <w:szCs w:val="30"/>
         </w:rPr>
@@ -963,6 +1083,9 @@
         <w:spacing w:after="140" w:line="276"/>
       </w:pPr>
       <w:r>
+        <w:rPr>
+          <w:color w:val="58595B"/>
+        </w:rPr>
         <w:t xml:space="preserve">Τσεκάρετε τη «Λειτουργία διασταύρωσης». Παραλείπεται η ταμειακή συμφωνία και ο έλεγχος της επιταγής, και στη θέση τους μπαίνει ο πίνακας αναφορά προς αναφορά: ροές στις γραμμές, αναφορές στις στήλες, με στήλη εύρους. Σε αυτή τη λειτουργία δεν παράγεται αρχείο SAP.</w:t>
       </w:r>
     </w:p>
@@ -975,7 +1098,7 @@
         <w:rPr>
           <w:b/>
           <w:bCs/>
-          <w:color w:val="062E5C"/>
+          <w:color w:val="1B75BB"/>
           <w:sz w:val="30"/>
           <w:szCs w:val="30"/>
         </w:rPr>
@@ -1005,7 +1128,7 @@
         <w:tc>
           <w:tcPr>
             <w:tcW w:type="dxa" w:w="2600"/>
-            <w:shd w:fill="062E5C" w:val="clear"/>
+            <w:shd w:fill="1B75BB" w:val="clear"/>
             <w:tcMar>
               <w:top w:type="dxa" w:w="60"/>
               <w:left w:type="dxa" w:w="100"/>
@@ -1032,7 +1155,7 @@
         <w:tc>
           <w:tcPr>
             <w:tcW w:type="dxa" w:w="6426"/>
-            <w:shd w:fill="062E5C" w:val="clear"/>
+            <w:shd w:fill="1B75BB" w:val="clear"/>
             <w:tcMar>
               <w:top w:type="dxa" w:w="60"/>
               <w:left w:type="dxa" w:w="100"/>
@@ -1074,6 +1197,7 @@
             </w:pPr>
             <w:r>
               <w:rPr>
+                <w:color w:val="58595B"/>
                 <w:sz w:val="19"/>
                 <w:szCs w:val="19"/>
               </w:rPr>
@@ -1097,6 +1221,7 @@
             </w:pPr>
             <w:r>
               <w:rPr>
+                <w:color w:val="58595B"/>
                 <w:sz w:val="19"/>
                 <w:szCs w:val="19"/>
               </w:rPr>
@@ -1109,19 +1234,21 @@
         <w:tc>
           <w:tcPr>
             <w:tcW w:type="dxa" w:w="2600"/>
-            <w:tcMar>
-              <w:top w:type="dxa" w:w="60"/>
-              <w:left w:type="dxa" w:w="100"/>
-              <w:bottom w:type="dxa" w:w="60"/>
-              <w:right w:type="dxa" w:w="100"/>
-            </w:tcMar>
-          </w:tcPr>
-          <w:p>
-            <w:pPr>
-              <w:spacing w:after="0" w:line="252"/>
-            </w:pPr>
-            <w:r>
-              <w:rPr>
+            <w:shd w:fill="EAEAEA" w:val="clear"/>
+            <w:tcMar>
+              <w:top w:type="dxa" w:w="60"/>
+              <w:left w:type="dxa" w:w="100"/>
+              <w:bottom w:type="dxa" w:w="60"/>
+              <w:right w:type="dxa" w:w="100"/>
+            </w:tcMar>
+          </w:tcPr>
+          <w:p>
+            <w:pPr>
+              <w:spacing w:after="0" w:line="252"/>
+            </w:pPr>
+            <w:r>
+              <w:rPr>
+                <w:color w:val="58595B"/>
                 <w:sz w:val="19"/>
                 <w:szCs w:val="19"/>
               </w:rPr>
@@ -1132,19 +1259,21 @@
         <w:tc>
           <w:tcPr>
             <w:tcW w:type="dxa" w:w="6426"/>
-            <w:tcMar>
-              <w:top w:type="dxa" w:w="60"/>
-              <w:left w:type="dxa" w:w="100"/>
-              <w:bottom w:type="dxa" w:w="60"/>
-              <w:right w:type="dxa" w:w="100"/>
-            </w:tcMar>
-          </w:tcPr>
-          <w:p>
-            <w:pPr>
-              <w:spacing w:after="0" w:line="252"/>
-            </w:pPr>
-            <w:r>
-              <w:rPr>
+            <w:shd w:fill="EAEAEA" w:val="clear"/>
+            <w:tcMar>
+              <w:top w:type="dxa" w:w="60"/>
+              <w:left w:type="dxa" w:w="100"/>
+              <w:bottom w:type="dxa" w:w="60"/>
+              <w:right w:type="dxa" w:w="100"/>
+            </w:tcMar>
+          </w:tcPr>
+          <w:p>
+            <w:pPr>
+              <w:spacing w:after="0" w:line="252"/>
+            </w:pPr>
+            <w:r>
+              <w:rPr>
+                <w:color w:val="58595B"/>
                 <w:sz w:val="19"/>
                 <w:szCs w:val="19"/>
               </w:rPr>
@@ -1170,6 +1299,7 @@
             </w:pPr>
             <w:r>
               <w:rPr>
+                <w:color w:val="58595B"/>
                 <w:sz w:val="19"/>
                 <w:szCs w:val="19"/>
               </w:rPr>
@@ -1193,6 +1323,7 @@
             </w:pPr>
             <w:r>
               <w:rPr>
+                <w:color w:val="58595B"/>
                 <w:sz w:val="19"/>
                 <w:szCs w:val="19"/>
               </w:rPr>
@@ -1205,19 +1336,21 @@
         <w:tc>
           <w:tcPr>
             <w:tcW w:type="dxa" w:w="2600"/>
-            <w:tcMar>
-              <w:top w:type="dxa" w:w="60"/>
-              <w:left w:type="dxa" w:w="100"/>
-              <w:bottom w:type="dxa" w:w="60"/>
-              <w:right w:type="dxa" w:w="100"/>
-            </w:tcMar>
-          </w:tcPr>
-          <w:p>
-            <w:pPr>
-              <w:spacing w:after="0" w:line="252"/>
-            </w:pPr>
-            <w:r>
-              <w:rPr>
+            <w:shd w:fill="EAEAEA" w:val="clear"/>
+            <w:tcMar>
+              <w:top w:type="dxa" w:w="60"/>
+              <w:left w:type="dxa" w:w="100"/>
+              <w:bottom w:type="dxa" w:w="60"/>
+              <w:right w:type="dxa" w:w="100"/>
+            </w:tcMar>
+          </w:tcPr>
+          <w:p>
+            <w:pPr>
+              <w:spacing w:after="0" w:line="252"/>
+            </w:pPr>
+            <w:r>
+              <w:rPr>
+                <w:color w:val="58595B"/>
                 <w:sz w:val="19"/>
                 <w:szCs w:val="19"/>
               </w:rPr>
@@ -1228,19 +1361,21 @@
         <w:tc>
           <w:tcPr>
             <w:tcW w:type="dxa" w:w="6426"/>
-            <w:tcMar>
-              <w:top w:type="dxa" w:w="60"/>
-              <w:left w:type="dxa" w:w="100"/>
-              <w:bottom w:type="dxa" w:w="60"/>
-              <w:right w:type="dxa" w:w="100"/>
-            </w:tcMar>
-          </w:tcPr>
-          <w:p>
-            <w:pPr>
-              <w:spacing w:after="0" w:line="252"/>
-            </w:pPr>
-            <w:r>
-              <w:rPr>
+            <w:shd w:fill="EAEAEA" w:val="clear"/>
+            <w:tcMar>
+              <w:top w:type="dxa" w:w="60"/>
+              <w:left w:type="dxa" w:w="100"/>
+              <w:bottom w:type="dxa" w:w="60"/>
+              <w:right w:type="dxa" w:w="100"/>
+            </w:tcMar>
+          </w:tcPr>
+          <w:p>
+            <w:pPr>
+              <w:spacing w:after="0" w:line="252"/>
+            </w:pPr>
+            <w:r>
+              <w:rPr>
+                <w:color w:val="58595B"/>
                 <w:sz w:val="19"/>
                 <w:szCs w:val="19"/>
               </w:rPr>
@@ -1266,6 +1401,7 @@
             </w:pPr>
             <w:r>
               <w:rPr>
+                <w:color w:val="58595B"/>
                 <w:sz w:val="19"/>
                 <w:szCs w:val="19"/>
               </w:rPr>
@@ -1289,6 +1425,7 @@
             </w:pPr>
             <w:r>
               <w:rPr>
+                <w:color w:val="58595B"/>
                 <w:sz w:val="19"/>
                 <w:szCs w:val="19"/>
               </w:rPr>
@@ -1301,19 +1438,21 @@
         <w:tc>
           <w:tcPr>
             <w:tcW w:type="dxa" w:w="2600"/>
-            <w:tcMar>
-              <w:top w:type="dxa" w:w="60"/>
-              <w:left w:type="dxa" w:w="100"/>
-              <w:bottom w:type="dxa" w:w="60"/>
-              <w:right w:type="dxa" w:w="100"/>
-            </w:tcMar>
-          </w:tcPr>
-          <w:p>
-            <w:pPr>
-              <w:spacing w:after="0" w:line="252"/>
-            </w:pPr>
-            <w:r>
-              <w:rPr>
+            <w:shd w:fill="EAEAEA" w:val="clear"/>
+            <w:tcMar>
+              <w:top w:type="dxa" w:w="60"/>
+              <w:left w:type="dxa" w:w="100"/>
+              <w:bottom w:type="dxa" w:w="60"/>
+              <w:right w:type="dxa" w:w="100"/>
+            </w:tcMar>
+          </w:tcPr>
+          <w:p>
+            <w:pPr>
+              <w:spacing w:after="0" w:line="252"/>
+            </w:pPr>
+            <w:r>
+              <w:rPr>
+                <w:color w:val="58595B"/>
                 <w:sz w:val="19"/>
                 <w:szCs w:val="19"/>
               </w:rPr>
@@ -1324,19 +1463,21 @@
         <w:tc>
           <w:tcPr>
             <w:tcW w:type="dxa" w:w="6426"/>
-            <w:tcMar>
-              <w:top w:type="dxa" w:w="60"/>
-              <w:left w:type="dxa" w:w="100"/>
-              <w:bottom w:type="dxa" w:w="60"/>
-              <w:right w:type="dxa" w:w="100"/>
-            </w:tcMar>
-          </w:tcPr>
-          <w:p>
-            <w:pPr>
-              <w:spacing w:after="0" w:line="252"/>
-            </w:pPr>
-            <w:r>
-              <w:rPr>
+            <w:shd w:fill="EAEAEA" w:val="clear"/>
+            <w:tcMar>
+              <w:top w:type="dxa" w:w="60"/>
+              <w:left w:type="dxa" w:w="100"/>
+              <w:bottom w:type="dxa" w:w="60"/>
+              <w:right w:type="dxa" w:w="100"/>
+            </w:tcMar>
+          </w:tcPr>
+          <w:p>
+            <w:pPr>
+              <w:spacing w:after="0" w:line="252"/>
+            </w:pPr>
+            <w:r>
+              <w:rPr>
+                <w:color w:val="58595B"/>
                 <w:sz w:val="19"/>
                 <w:szCs w:val="19"/>
               </w:rPr>
@@ -1362,6 +1503,7 @@
             </w:pPr>
             <w:r>
               <w:rPr>
+                <w:color w:val="58595B"/>
                 <w:sz w:val="19"/>
                 <w:szCs w:val="19"/>
               </w:rPr>
@@ -1385,6 +1527,7 @@
             </w:pPr>
             <w:r>
               <w:rPr>
+                <w:color w:val="58595B"/>
                 <w:sz w:val="19"/>
                 <w:szCs w:val="19"/>
               </w:rPr>
@@ -1399,6 +1542,9 @@
         <w:spacing w:after="80" w:line="276"/>
       </w:pPr>
       <w:r>
+        <w:rPr>
+          <w:color w:val="58595B"/>
+        </w:rPr>
         <w:t xml:space="preserve"/>
       </w:r>
     </w:p>
@@ -1411,7 +1557,7 @@
         <w:rPr>
           <w:b/>
           <w:bCs/>
-          <w:color w:val="0072BC"/>
+          <w:color w:val="069FEC"/>
           <w:sz w:val="24"/>
           <w:szCs w:val="24"/>
         </w:rPr>
@@ -1423,6 +1569,9 @@
         <w:spacing w:after="140" w:line="276"/>
       </w:pPr>
       <w:r>
+        <w:rPr>
+          <w:color w:val="58595B"/>
+        </w:rPr>
         <w:t xml:space="preserve">Τα μπλε γράμματα σημαίνουν τιμή που ήρθε από αναφορά πηγής. Τα μαύρα, τύπο. Τα πράσινα, σύνδεση με άλλο φύλλο. Το κίτρινο γέμισμα, κελί ελέγχου που πρέπει να δείχνει μηδέν.</w:t>
       </w:r>
     </w:p>
@@ -1431,14 +1580,18 @@
         <w:spacing w:after="140" w:line="276"/>
       </w:pPr>
       <w:r>
+        <w:rPr>
+          <w:color w:val="58595B"/>
+        </w:rPr>
         <w:t xml:space="preserve">Κάθε υποσύνολο, σύνολο, διαφορά και έλεγχος είναι ζωντανός τύπος. Αλλάξτε ένα μπλε κελί και το βιβλίο ή ξαναδένει ή σας δείχνει πού έσπασε.</w:t>
       </w:r>
     </w:p>
     <w:p>
       <w:pPr>
         <w:pBdr>
-          <w:left w:val="single" w:color="B45F06" w:sz="18" w:space="8"/>
+          <w:left w:val="single" w:color="8BC53F" w:sz="18" w:space="8"/>
         </w:pBdr>
+        <w:shd w:fill="F4F9EC" w:val="clear"/>
         <w:spacing w:after="160" w:before="140" w:line="276"/>
         <w:ind w:left="200"/>
       </w:pPr>
@@ -1446,7 +1599,7 @@
         <w:rPr>
           <w:i/>
           <w:iCs/>
-          <w:color w:val="6B4A10"/>
+          <w:color w:val="58595B"/>
         </w:rPr>
         <w:t xml:space="preserve">Καμία διαφορά δεν βουλώνεται. Ανεξήγητη διαφορά είναι εύρημα: βγαίνει με κόκκινο, με τις δύο πλευρές και το χάσμα ανάμεσά τους.</w:t>
       </w:r>
@@ -1460,7 +1613,7 @@
         <w:rPr>
           <w:b/>
           <w:bCs/>
-          <w:color w:val="062E5C"/>
+          <w:color w:val="1B75BB"/>
           <w:sz w:val="30"/>
           <w:szCs w:val="30"/>
         </w:rPr>
@@ -1477,6 +1630,9 @@
         <w:spacing w:after="80" w:line="276"/>
       </w:pPr>
       <w:r>
+        <w:rPr>
+          <w:color w:val="58595B"/>
+        </w:rPr>
         <w:t xml:space="preserve">Όλα τα αρχεία διαβάζονται και καθένα αντιστοιχεί σε ένα μόνο είδος αναφοράς.</w:t>
       </w:r>
     </w:p>
@@ -1490,6 +1646,9 @@
         <w:spacing w:after="80" w:line="276"/>
       </w:pPr>
       <w:r>
+        <w:rPr>
+          <w:color w:val="58595B"/>
+        </w:rPr>
         <w:t xml:space="preserve">Ένα νοσοκομείο, ένας μήνας σε όλη την παρτίδα.</w:t>
       </w:r>
     </w:p>
@@ -1503,6 +1662,9 @@
         <w:spacing w:after="80" w:line="276"/>
       </w:pPr>
       <w:r>
+        <w:rPr>
+          <w:color w:val="58595B"/>
+        </w:rPr>
         <w:t xml:space="preserve">Το απαραίτητο σετ είναι πλήρες, ή έχετε τσεκάρει τη λειτουργία διασταύρωσης.</w:t>
       </w:r>
     </w:p>
@@ -1516,6 +1678,9 @@
         <w:spacing w:after="80" w:line="276"/>
       </w:pPr>
       <w:r>
+        <w:rPr>
+          <w:color w:val="58595B"/>
+        </w:rPr>
         <w:t xml:space="preserve">Δένουν οι εσωτερικές ισότητες: το σύνολο των ενδονοσοκομειακών με το άθροισμα των γραμμών του, το Inpatient του αρχείου «all» με το ίδιο σύνολο, και οι γραμμές της επιταγής με το δηλωμένο ποσό.</w:t>
       </w:r>
     </w:p>
@@ -1529,6 +1694,9 @@
         <w:spacing w:after="80" w:line="276"/>
       </w:pPr>
       <w:r>
+        <w:rPr>
+          <w:color w:val="58595B"/>
+        </w:rPr>
         <w:t xml:space="preserve">Το βιβλίο ξανανοίγει μόλις χτιστεί και κάθε κελί ελέγχου ξαναϋπολογίζεται. Όλα πρέπει να δείχνουν μηδέν.</w:t>
       </w:r>
     </w:p>
@@ -1537,6 +1705,9 @@
         <w:spacing w:after="140" w:line="276"/>
       </w:pPr>
       <w:r>
+        <w:rPr>
+          <w:color w:val="58595B"/>
+        </w:rPr>
         <w:t xml:space="preserve">Οι γνωστές αποκλίσεις σχολιάζονται αυτόματα: το Z-catalogue που στο GL βγαίνει χαμηλότερο, οι απαιτήσεις φαρμάκων που ο ΟΑΥ πληρώνει ψηλότερα από το GL λόγω γενοσήμων, εκπτώσεων και συμμετοχών, η αμοιβή φαρμακοποιού που στο GL κάθεται σταθερή ενώ η αναφορά δίνει συσκευασίες επί 1,60. Σχολιάζονται όμως, δεν κρύβονται.</w:t>
       </w:r>
     </w:p>
@@ -1549,7 +1720,7 @@
         <w:rPr>
           <w:b/>
           <w:bCs/>
-          <w:color w:val="062E5C"/>
+          <w:color w:val="1B75BB"/>
           <w:sz w:val="30"/>
           <w:szCs w:val="30"/>
         </w:rPr>
@@ -1561,6 +1732,9 @@
         <w:spacing w:after="140" w:line="276"/>
       </w:pPr>
       <w:r>
+        <w:rPr>
+          <w:color w:val="58595B"/>
+        </w:rPr>
         <w:t xml:space="preserve">Οι εταιρείες, τα κέντρα κόστους και το λογιστικό σχέδιο είναι ήδη μέσα στο εργαλείο. Δεν χρειάζεται να τα ανεβάζετε κάθε μήνα· στη σύνοψη κάθε εκτέλεσης γράφει ποια έκδοση απάντησε.</w:t>
       </w:r>
     </w:p>
@@ -1573,7 +1747,7 @@
         <w:rPr>
           <w:b/>
           <w:bCs/>
-          <w:color w:val="0072BC"/>
+          <w:color w:val="069FEC"/>
           <w:sz w:val="24"/>
           <w:szCs w:val="24"/>
         </w:rPr>
@@ -1585,6 +1759,9 @@
         <w:spacing w:after="140" w:line="276"/>
       </w:pPr>
       <w:r>
+        <w:rPr>
+          <w:color w:val="58595B"/>
+        </w:rPr>
         <w:t xml:space="preserve">Όταν το Λογιστήριο εκδώσει νέο Chart_of_accounts.XLSX έχετε δύο δρόμους.</w:t>
       </w:r>
     </w:p>
@@ -1598,6 +1775,9 @@
         <w:spacing w:after="80" w:line="276"/>
       </w:pPr>
       <w:r>
+        <w:rPr>
+          <w:color w:val="58595B"/>
+        </w:rPr>
         <w:t xml:space="preserve">Για μία εκτέλεση: ανεβάστε το μαζί με τα αρχεία του μήνα. Το ανεβασμένο αρχείο υπερισχύει πάντα του ενσωματωμένου.</w:t>
       </w:r>
     </w:p>
@@ -1611,19 +1791,22 @@
         <w:spacing w:after="80" w:line="276"/>
       </w:pPr>
       <w:r>
+        <w:rPr>
+          <w:color w:val="58595B"/>
+        </w:rPr>
         <w:t xml:space="preserve">Μόνιμα: τρέξτε στο αποθετήριο τις δύο εντολές που ακολουθούν και μοιράστε το νέο okypy-recon.html. Το δεύτερο όρισμα είναι η σήμανση έκδοσης που θα βλέπετε στην οθόνη.</w:t>
       </w:r>
     </w:p>
     <w:p>
       <w:pPr>
-        <w:shd w:fill="F2F5F8" w:val="clear"/>
+        <w:shd w:fill="EAEAEA" w:val="clear"/>
         <w:spacing w:after="60" w:before="60"/>
         <w:ind w:left="240"/>
       </w:pPr>
       <w:r>
         <w:rPr>
           <w:rFonts w:ascii="Consolas" w:cs="Consolas" w:eastAsia="Consolas" w:hAnsi="Consolas"/>
-          <w:color w:val="062E5C"/>
+          <w:color w:val="1B75BB"/>
           <w:sz w:val="19"/>
           <w:szCs w:val="19"/>
         </w:rPr>
@@ -1632,14 +1815,14 @@
     </w:p>
     <w:p>
       <w:pPr>
-        <w:shd w:fill="F2F5F8" w:val="clear"/>
+        <w:shd w:fill="EAEAEA" w:val="clear"/>
         <w:spacing w:after="60" w:before="60"/>
         <w:ind w:left="240"/>
       </w:pPr>
       <w:r>
         <w:rPr>
           <w:rFonts w:ascii="Consolas" w:cs="Consolas" w:eastAsia="Consolas" w:hAnsi="Consolas"/>
-          <w:color w:val="062E5C"/>
+          <w:color w:val="1B75BB"/>
           <w:sz w:val="19"/>
           <w:szCs w:val="19"/>
         </w:rPr>
@@ -1651,6 +1834,9 @@
         <w:spacing w:after="140" w:line="276"/>
       </w:pPr>
       <w:r>
+        <w:rPr>
+          <w:color w:val="58595B"/>
+        </w:rPr>
         <w:t xml:space="preserve">Το αρχείο αναμένεται με τα φύλλα «Company Codes», «Cost centers» και «Chart of accounts». Το φύλλο «SAP GL AC - COM ITEM» αγνοείται, γι’ αυτό και οι στήλες BSEG-FIPOS, GEBER και FISTL του ημερολογίου μένουν κενές.</w:t>
       </w:r>
     </w:p>
@@ -1663,7 +1849,7 @@
         <w:rPr>
           <w:b/>
           <w:bCs/>
-          <w:color w:val="0072BC"/>
+          <w:color w:val="069FEC"/>
           <w:sz w:val="24"/>
           <w:szCs w:val="24"/>
         </w:rPr>
@@ -1675,6 +1861,9 @@
         <w:spacing w:after="140" w:line="276"/>
       </w:pPr>
       <w:r>
+        <w:rPr>
+          <w:color w:val="58595B"/>
+        </w:rPr>
         <w:t xml:space="preserve">Η αγγλική ειδικότητα του ΟΑΥ αντιστοιχεί πρώτα σε ελληνικό θέμα ονόματος, για παράδειγμα RENAL DISEASES σε ΝΕΦΡΟΛΟΓΙΚ, και μετά στη μορφή που ταιριάζει στη ροή: ΘΑΛ για τα ενδονοσοκομειακά, ΗΦ για την ημερήσια φροντίδα, ΕΙ για τα εξωτερικά ιατρεία, ΓΕΝΙΚΑ για τα υπόλοιπα. Όπου δεν υπάρχει ΗΦ, η ημερήσια φροντίδα πέφτει στο ΕΙ.</w:t>
       </w:r>
     </w:p>
@@ -1683,6 +1872,9 @@
         <w:spacing w:after="140" w:line="276"/>
       </w:pPr>
       <w:r>
+        <w:rPr>
+          <w:color w:val="58595B"/>
+        </w:rPr>
         <w:t xml:space="preserve">Γραμμή που δεν αντιστοιχείται μονοσήμαντα μένει κενή και εμφανίζεται στο φύλλο Έλεγχος_SAP με τον λόγο. Το εργαλείο δεν επινοεί κωδικό.</w:t>
       </w:r>
     </w:p>
@@ -1695,7 +1887,7 @@
         <w:rPr>
           <w:b/>
           <w:bCs/>
-          <w:color w:val="062E5C"/>
+          <w:color w:val="1B75BB"/>
           <w:sz w:val="30"/>
           <w:szCs w:val="30"/>
         </w:rPr>
@@ -1707,6 +1899,9 @@
         <w:spacing w:after="140" w:line="276"/>
       </w:pPr>
       <w:r>
+        <w:rPr>
+          <w:color w:val="58595B"/>
+        </w:rPr>
         <w:t xml:space="preserve">Το αρχείο εγγραφών έχει τρία φύλλα.</w:t>
       </w:r>
     </w:p>
@@ -1733,7 +1928,7 @@
         <w:tc>
           <w:tcPr>
             <w:tcW w:type="dxa" w:w="2200"/>
-            <w:shd w:fill="062E5C" w:val="clear"/>
+            <w:shd w:fill="1B75BB" w:val="clear"/>
             <w:tcMar>
               <w:top w:type="dxa" w:w="60"/>
               <w:left w:type="dxa" w:w="100"/>
@@ -1760,7 +1955,7 @@
         <w:tc>
           <w:tcPr>
             <w:tcW w:type="dxa" w:w="6826"/>
-            <w:shd w:fill="062E5C" w:val="clear"/>
+            <w:shd w:fill="1B75BB" w:val="clear"/>
             <w:tcMar>
               <w:top w:type="dxa" w:w="60"/>
               <w:left w:type="dxa" w:w="100"/>
@@ -1802,6 +1997,7 @@
             </w:pPr>
             <w:r>
               <w:rPr>
+                <w:color w:val="58595B"/>
                 <w:sz w:val="19"/>
                 <w:szCs w:val="19"/>
               </w:rPr>
@@ -1825,6 +2021,7 @@
             </w:pPr>
             <w:r>
               <w:rPr>
+                <w:color w:val="58595B"/>
                 <w:sz w:val="19"/>
                 <w:szCs w:val="19"/>
               </w:rPr>
@@ -1837,19 +2034,21 @@
         <w:tc>
           <w:tcPr>
             <w:tcW w:type="dxa" w:w="2200"/>
-            <w:tcMar>
-              <w:top w:type="dxa" w:w="60"/>
-              <w:left w:type="dxa" w:w="100"/>
-              <w:bottom w:type="dxa" w:w="60"/>
-              <w:right w:type="dxa" w:w="100"/>
-            </w:tcMar>
-          </w:tcPr>
-          <w:p>
-            <w:pPr>
-              <w:spacing w:after="0" w:line="252"/>
-            </w:pPr>
-            <w:r>
-              <w:rPr>
+            <w:shd w:fill="EAEAEA" w:val="clear"/>
+            <w:tcMar>
+              <w:top w:type="dxa" w:w="60"/>
+              <w:left w:type="dxa" w:w="100"/>
+              <w:bottom w:type="dxa" w:w="60"/>
+              <w:right w:type="dxa" w:w="100"/>
+            </w:tcMar>
+          </w:tcPr>
+          <w:p>
+            <w:pPr>
+              <w:spacing w:after="0" w:line="252"/>
+            </w:pPr>
+            <w:r>
+              <w:rPr>
+                <w:color w:val="58595B"/>
                 <w:sz w:val="19"/>
                 <w:szCs w:val="19"/>
               </w:rPr>
@@ -1860,19 +2059,21 @@
         <w:tc>
           <w:tcPr>
             <w:tcW w:type="dxa" w:w="6826"/>
-            <w:tcMar>
-              <w:top w:type="dxa" w:w="60"/>
-              <w:left w:type="dxa" w:w="100"/>
-              <w:bottom w:type="dxa" w:w="60"/>
-              <w:right w:type="dxa" w:w="100"/>
-            </w:tcMar>
-          </w:tcPr>
-          <w:p>
-            <w:pPr>
-              <w:spacing w:after="0" w:line="252"/>
-            </w:pPr>
-            <w:r>
-              <w:rPr>
+            <w:shd w:fill="EAEAEA" w:val="clear"/>
+            <w:tcMar>
+              <w:top w:type="dxa" w:w="60"/>
+              <w:left w:type="dxa" w:w="100"/>
+              <w:bottom w:type="dxa" w:w="60"/>
+              <w:right w:type="dxa" w:w="100"/>
+            </w:tcMar>
+          </w:tcPr>
+          <w:p>
+            <w:pPr>
+              <w:spacing w:after="0" w:line="252"/>
+            </w:pPr>
+            <w:r>
+              <w:rPr>
+                <w:color w:val="58595B"/>
                 <w:sz w:val="19"/>
                 <w:szCs w:val="19"/>
               </w:rPr>
@@ -1898,6 +2099,7 @@
             </w:pPr>
             <w:r>
               <w:rPr>
+                <w:color w:val="58595B"/>
                 <w:sz w:val="19"/>
                 <w:szCs w:val="19"/>
               </w:rPr>
@@ -1921,6 +2123,7 @@
             </w:pPr>
             <w:r>
               <w:rPr>
+                <w:color w:val="58595B"/>
                 <w:sz w:val="19"/>
                 <w:szCs w:val="19"/>
               </w:rPr>
@@ -1935,6 +2138,9 @@
         <w:spacing w:after="80" w:line="276"/>
       </w:pPr>
       <w:r>
+        <w:rPr>
+          <w:color w:val="58595B"/>
+        </w:rPr>
         <w:t xml:space="preserve"/>
       </w:r>
     </w:p>
@@ -1947,7 +2153,7 @@
         <w:rPr>
           <w:b/>
           <w:bCs/>
-          <w:color w:val="0072BC"/>
+          <w:color w:val="069FEC"/>
           <w:sz w:val="24"/>
           <w:szCs w:val="24"/>
         </w:rPr>
@@ -1964,6 +2170,9 @@
         <w:spacing w:after="80" w:line="276"/>
       </w:pPr>
       <w:r>
+        <w:rPr>
+          <w:color w:val="58595B"/>
+        </w:rPr>
         <w:t xml:space="preserve">Πριν από οτιδήποτε άλλο ανοίξτε το φύλλο Έλεγχος_SAP. Κάθε κελί ελέγχου πρέπει να δείχνει μηδέν και καμία γραμμή με ποσό δεν πρέπει να είναι χωρίς κέντρο κόστους. Αν βρείτε τέτοια, διορθώστε πρώτα την αιτία — συνήθως λείπει κέντρο κόστους από το λογιστικό σχέδιο.</w:t>
       </w:r>
     </w:p>
@@ -1977,6 +2186,9 @@
         <w:spacing w:after="80" w:line="276"/>
       </w:pPr>
       <w:r>
+        <w:rPr>
+          <w:color w:val="58595B"/>
+        </w:rPr>
         <w:t xml:space="preserve">Συνδεθείτε στο SAP και τρέξτε την έκθεση ZSHSO_FI_POST_UPL_V1, μέσω SA38 ή SE38 ή με τον κωδικό συναλλαγής που σας έχει δοθεί.</w:t>
       </w:r>
     </w:p>
@@ -1990,6 +2202,9 @@
         <w:spacing w:after="80" w:line="276"/>
       </w:pPr>
       <w:r>
+        <w:rPr>
+          <w:color w:val="58595B"/>
+        </w:rPr>
         <w:t xml:space="preserve">Στην οθόνη επιλογής δώστε τη διαδρομή του αρχείου, το φύλλο JOURNAL ENTRIES και πρώτη γραμμή δεδομένων τη 4.</w:t>
       </w:r>
     </w:p>
@@ -2003,6 +2218,9 @@
         <w:spacing w:after="80" w:line="276"/>
       </w:pPr>
       <w:r>
+        <w:rPr>
+          <w:color w:val="58595B"/>
+        </w:rPr>
         <w:t xml:space="preserve">Τρέξτε πρώτα σε δοκιμαστική εκτέλεση και διαβάστε το log. Κάθε γραμμή πρέπει να περνά. Τα συνηθισμένα σφάλματα είναι κλειστή λογιστική περίοδος, μπλοκαρισμένος λογαριασμός ή κέντρο κόστους, κέντρο κόστους που ανήκει σε άλλη εταιρεία, ή απαίτηση για πεδία Funds Management.</w:t>
       </w:r>
     </w:p>
@@ -2016,6 +2234,9 @@
         <w:spacing w:after="80" w:line="276"/>
       </w:pPr>
       <w:r>
+        <w:rPr>
+          <w:color w:val="58595B"/>
+        </w:rPr>
         <w:t xml:space="preserve">Ξανατρέξτε χωρίς τη σήμανση δοκιμής και κρατήστε τους αριθμούς παραστατικών που επιστρέφει.</w:t>
       </w:r>
     </w:p>
@@ -2029,6 +2250,9 @@
         <w:spacing w:after="80" w:line="276"/>
       </w:pPr>
       <w:r>
+        <w:rPr>
+          <w:color w:val="58595B"/>
+        </w:rPr>
         <w:t xml:space="preserve">Επαληθεύστε σε FB03 ή FAGLL03 ότι το σύνολο του παραστατικού ισούται με το ποσό της επιταγής.</w:t>
       </w:r>
     </w:p>
@@ -2042,14 +2266,18 @@
         <w:spacing w:after="80" w:line="276"/>
       </w:pPr>
       <w:r>
+        <w:rPr>
+          <w:color w:val="58595B"/>
+        </w:rPr>
         <w:t xml:space="preserve">Αρχειοθετήστε μαζί το βιβλίο συμφωνίας, το αρχείο SAP και τους αριθμούς των παραστατικών.</w:t>
       </w:r>
     </w:p>
     <w:p>
       <w:pPr>
         <w:pBdr>
-          <w:left w:val="single" w:color="B45F06" w:sz="18" w:space="8"/>
+          <w:left w:val="single" w:color="8BC53F" w:sz="18" w:space="8"/>
         </w:pBdr>
+        <w:shd w:fill="F4F9EC" w:val="clear"/>
         <w:spacing w:after="160" w:before="140" w:line="276"/>
         <w:ind w:left="200"/>
       </w:pPr>
@@ -2057,7 +2285,7 @@
         <w:rPr>
           <w:i/>
           <w:iCs/>
-          <w:color w:val="6B4A10"/>
+          <w:color w:val="58595B"/>
         </w:rPr>
         <w:t xml:space="preserve">Τα βήματα 2 και 3 εξαρτώνται από τη ρύθμιση της έκθεσης στο δικό μας σύστημα: κωδικός συναλλαγής, μορφή αρχείου που δέχεται, ονόματα παραμέτρων. Επιβεβαιώστε τα μία φορά με την ομάδα SAP και σημειώστε τα εδώ. Αν η έκθεση ζητά επίπεδο αρχείο αντί για Excel, αποθηκεύστε το φύλλο JOURNAL ENTRIES ως Text (Tab delimited), αφού πρώτα διαγράψετε τις στήλες X και Y.</w:t>
       </w:r>
@@ -2071,7 +2299,7 @@
         <w:rPr>
           <w:b/>
           <w:bCs/>
-          <w:color w:val="062E5C"/>
+          <w:color w:val="1B75BB"/>
           <w:sz w:val="30"/>
           <w:szCs w:val="30"/>
         </w:rPr>
@@ -2088,6 +2316,9 @@
         <w:spacing w:after="80" w:line="276"/>
       </w:pPr>
       <w:r>
+        <w:rPr>
+          <w:color w:val="58595B"/>
+        </w:rPr>
         <w:t xml:space="preserve">Σκαναρισμένη επιταγή: επικολλήστε το κείμενο στη Χειροκίνητη επιλογή και αφαιρέστε από τη λίστα το αρχείο που δεν αναγνωρίστηκε.</w:t>
       </w:r>
     </w:p>
@@ -2101,6 +2332,9 @@
         <w:spacing w:after="80" w:line="276"/>
       </w:pPr>
       <w:r>
+        <w:rPr>
+          <w:color w:val="58595B"/>
+        </w:rPr>
         <w:t xml:space="preserve">Μικτή παρτίδα: δύο νοσοκομεία ή δύο μήνες μαζί σταματούν την εκτέλεση. Χωρίστε τα αρχεία και τρέξτε δύο φορές.</w:t>
       </w:r>
     </w:p>
@@ -2114,6 +2348,9 @@
         <w:spacing w:after="80" w:line="276"/>
       </w:pPr>
       <w:r>
+        <w:rPr>
+          <w:color w:val="58595B"/>
+        </w:rPr>
         <w:t xml:space="preserve">Γραμμή με ποσό αλλά χωρίς κέντρο κόστους: μη την αγνοήσετε. Δείτε τον λόγο στο Έλεγχος_SAP, συμπληρώστε το κέντρο στο λογιστικό σχέδιο και ξανατρέξτε.</w:t>
       </w:r>
     </w:p>
@@ -2127,6 +2364,9 @@
         <w:spacing w:after="80" w:line="276"/>
       </w:pPr>
       <w:r>
+        <w:rPr>
+          <w:color w:val="58595B"/>
+        </w:rPr>
         <w:t xml:space="preserve">Κενές στήλες FIPOS, GEBER και FISTL: είναι σκόπιμο. Αν το σύστημα τις απαιτεί, συμπληρώνονται από το φύλλο «SAP GL AC - COM ITEM» πριν την ανάρτηση.</w:t>
       </w:r>
     </w:p>
@@ -2139,7 +2379,7 @@
         <w:rPr>
           <w:b/>
           <w:bCs/>
-          <w:color w:val="062E5C"/>
+          <w:color w:val="1B75BB"/>
           <w:sz w:val="30"/>
           <w:szCs w:val="30"/>
         </w:rPr>
@@ -2151,6 +2391,9 @@
         <w:spacing w:after="140" w:line="276"/>
       </w:pPr>
       <w:r>
+        <w:rPr>
+          <w:color w:val="58595B"/>
+        </w:rPr>
         <w:t xml:space="preserve">Τα αρχεία του ΟΑΥ είναι εμπιστευτικά και δεν ανεβαίνουν ποτέ στο αποθετήριο του κώδικα. Το εργαλείο δεν κάνει καμία εξερχόμενη κλήση, δεν γράφει προσωρινά αρχεία και δεν κρατά τίποτα μετά το κλείσιμο της σελίδας.</w:t>
       </w:r>
     </w:p>
@@ -2159,6 +2402,9 @@
         <w:spacing w:after="200" w:line="276"/>
       </w:pPr>
       <w:r>
+        <w:rPr>
+          <w:color w:val="58595B"/>
+        </w:rPr>
         <w:t xml:space="preserve">Το εργαλείο υπάρχει σε δύο εκδόσεις με την ίδια ακριβώς λογική: το αυτόνομο okypy-recon.html, που ανοίγει με διπλό κλικ, και η έκδοση που τρέχει στον εσωτερικό server με streamlit run app.py.</w:t>
       </w:r>
     </w:p>
@@ -2170,7 +2416,7 @@
         <w:rPr>
           <w:i/>
           <w:iCs/>
-          <w:color w:val="595959"/>
+          <w:color w:val="58595B"/>
           <w:sz w:val="18"/>
           <w:szCs w:val="18"/>
         </w:rPr>
@@ -2233,15 +2479,22 @@
 <w:ftr xmlns:wpc="http://schemas.microsoft.com/office/word/2010/wordprocessingCanvas" xmlns:mc="http://schemas.openxmlformats.org/markup-compatibility/2006" xmlns:o="urn:schemas-microsoft-com:office:office" xmlns:r="http://schemas.openxmlformats.org/officeDocument/2006/relationships" xmlns:m="http://schemas.openxmlformats.org/officeDocument/2006/math" xmlns:v="urn:schemas-microsoft-com:vml" xmlns:wp14="http://schemas.microsoft.com/office/word/2010/wordprocessingDrawing" xmlns:wp="http://schemas.openxmlformats.org/drawingml/2006/wordprocessingDrawing" xmlns:w10="urn:schemas-microsoft-com:office:word" xmlns:w="http://schemas.openxmlformats.org/wordprocessingml/2006/main" xmlns:w14="http://schemas.microsoft.com/office/word/2010/wordml" xmlns:w15="http://schemas.microsoft.com/office/word/2012/wordml" xmlns:wpg="http://schemas.microsoft.com/office/word/2010/wordprocessingGroup" xmlns:wpi="http://schemas.microsoft.com/office/word/2010/wordprocessingInk" xmlns:wne="http://schemas.microsoft.com/office/word/2006/wordml" xmlns:wps="http://schemas.microsoft.com/office/word/2010/wordprocessingShape">
   <w:p>
     <w:pPr>
-      <w:jc w:val="right"/>
+      <w:pBdr>
+        <w:bottom w:val="single" w:color="069FEC" w:sz="24" w:space="1"/>
+      </w:pBdr>
+      <w:spacing w:after="40" w:before="0"/>
     </w:pPr>
+  </w:p>
+  <w:p>
     <w:r>
       <w:rPr>
-        <w:color w:val="595959"/>
+        <w:color w:val="58595B"/>
         <w:sz w:val="16"/>
         <w:szCs w:val="16"/>
       </w:rPr>
-      <w:t xml:space="preserve">ΟΚΥπΥ — Συμφωνία Πληρωμών ΟΑΥ · σελ. </w:t>
+      <w:t xml:space="preserve">ΟΚΥπΥ — Συμφωνία Πληρωμών ΟΑΥ</w:t>
+      <w:ptab w:alignment="right" w:relativeTo="margin" w:leader="none"/>
+      <w:t xml:space="preserve">σελ. </w:t>
       <w:fldChar w:fldCharType="begin"/>
       <w:instrText xml:space="preserve">PAGE</w:instrText>
       <w:fldChar w:fldCharType="separate"/>
@@ -2429,7 +2682,8 @@
   <w:docDefaults>
     <w:rPrDefault>
       <w:rPr>
-        <w:rFonts w:ascii="Calibri" w:cs="Calibri" w:eastAsia="Calibri" w:hAnsi="Calibri"/>
+        <w:rFonts w:ascii="Arial" w:cs="Arial" w:eastAsia="Arial" w:hAnsi="Arial"/>
+        <w:color w:val="58595B"/>
         <w:sz w:val="21"/>
         <w:szCs w:val="21"/>
       </w:rPr>

</xml_diff>

<commit_message>
Drop the SA38 aside from the SAP posting step
The step now reads «Συνδεθείτε στο SAP και τρέξτε την έκθεση
ZSHSO_FI_POST_UPL_V1.» in all four places it appears: the manual, the Word
document, and the «Οδηγίες_SAP» sheet in both ports. The closing caveat no
longer lists the transaction code among the things to confirm — only the file
format and the parameter names of step 3 remain open.

The Word document's numbered lists each get their own numbering instance, so a
section's steps start at 1 instead of continuing the count from the section
before it.

Co-Authored-By: Claude Opus 5 <noreply@anthropic.com>
Claude-Session: https://claude.ai/code/session_011MqasjYJgewtxKsgxp7Q1P
</commit_message>
<xml_diff>
--- a/docs/ΟΚΥπΥ_Συμφωνία_ΟΑΥ_Οδηγίες_Χρήσης.docx
+++ b/docs/ΟΚΥπΥ_Συμφωνία_ΟΑΥ_Οδηγίες_Χρήσης.docx
@@ -1625,7 +1625,7 @@
         <w:pStyle w:val="ListParagraph"/>
         <w:numPr>
           <w:ilvl w:val="0"/>
-          <w:numId w:val="3"/>
+          <w:numId w:val="4"/>
         </w:numPr>
         <w:spacing w:after="80" w:line="276"/>
       </w:pPr>
@@ -1641,7 +1641,7 @@
         <w:pStyle w:val="ListParagraph"/>
         <w:numPr>
           <w:ilvl w:val="0"/>
-          <w:numId w:val="3"/>
+          <w:numId w:val="4"/>
         </w:numPr>
         <w:spacing w:after="80" w:line="276"/>
       </w:pPr>
@@ -1657,7 +1657,7 @@
         <w:pStyle w:val="ListParagraph"/>
         <w:numPr>
           <w:ilvl w:val="0"/>
-          <w:numId w:val="3"/>
+          <w:numId w:val="4"/>
         </w:numPr>
         <w:spacing w:after="80" w:line="276"/>
       </w:pPr>
@@ -1673,7 +1673,7 @@
         <w:pStyle w:val="ListParagraph"/>
         <w:numPr>
           <w:ilvl w:val="0"/>
-          <w:numId w:val="3"/>
+          <w:numId w:val="4"/>
         </w:numPr>
         <w:spacing w:after="80" w:line="276"/>
       </w:pPr>
@@ -1689,7 +1689,7 @@
         <w:pStyle w:val="ListParagraph"/>
         <w:numPr>
           <w:ilvl w:val="0"/>
-          <w:numId w:val="3"/>
+          <w:numId w:val="4"/>
         </w:numPr>
         <w:spacing w:after="80" w:line="276"/>
       </w:pPr>
@@ -2165,7 +2165,7 @@
         <w:pStyle w:val="ListParagraph"/>
         <w:numPr>
           <w:ilvl w:val="0"/>
-          <w:numId w:val="3"/>
+          <w:numId w:val="5"/>
         </w:numPr>
         <w:spacing w:after="80" w:line="276"/>
       </w:pPr>
@@ -2181,7 +2181,7 @@
         <w:pStyle w:val="ListParagraph"/>
         <w:numPr>
           <w:ilvl w:val="0"/>
-          <w:numId w:val="3"/>
+          <w:numId w:val="5"/>
         </w:numPr>
         <w:spacing w:after="80" w:line="276"/>
       </w:pPr>
@@ -2189,7 +2189,7 @@
         <w:rPr>
           <w:color w:val="58595B"/>
         </w:rPr>
-        <w:t xml:space="preserve">Συνδεθείτε στο SAP και τρέξτε την έκθεση ZSHSO_FI_POST_UPL_V1, μέσω SA38 ή SE38 ή με τον κωδικό συναλλαγής που σας έχει δοθεί.</w:t>
+        <w:t xml:space="preserve">Συνδεθείτε στο SAP και τρέξτε την έκθεση ZSHSO_FI_POST_UPL_V1.</w:t>
       </w:r>
     </w:p>
     <w:p>
@@ -2197,7 +2197,7 @@
         <w:pStyle w:val="ListParagraph"/>
         <w:numPr>
           <w:ilvl w:val="0"/>
-          <w:numId w:val="3"/>
+          <w:numId w:val="5"/>
         </w:numPr>
         <w:spacing w:after="80" w:line="276"/>
       </w:pPr>
@@ -2213,7 +2213,7 @@
         <w:pStyle w:val="ListParagraph"/>
         <w:numPr>
           <w:ilvl w:val="0"/>
-          <w:numId w:val="3"/>
+          <w:numId w:val="5"/>
         </w:numPr>
         <w:spacing w:after="80" w:line="276"/>
       </w:pPr>
@@ -2229,7 +2229,7 @@
         <w:pStyle w:val="ListParagraph"/>
         <w:numPr>
           <w:ilvl w:val="0"/>
-          <w:numId w:val="3"/>
+          <w:numId w:val="5"/>
         </w:numPr>
         <w:spacing w:after="80" w:line="276"/>
       </w:pPr>
@@ -2245,7 +2245,7 @@
         <w:pStyle w:val="ListParagraph"/>
         <w:numPr>
           <w:ilvl w:val="0"/>
-          <w:numId w:val="3"/>
+          <w:numId w:val="5"/>
         </w:numPr>
         <w:spacing w:after="80" w:line="276"/>
       </w:pPr>
@@ -2261,7 +2261,7 @@
         <w:pStyle w:val="ListParagraph"/>
         <w:numPr>
           <w:ilvl w:val="0"/>
-          <w:numId w:val="3"/>
+          <w:numId w:val="5"/>
         </w:numPr>
         <w:spacing w:after="80" w:line="276"/>
       </w:pPr>
@@ -2287,7 +2287,7 @@
           <w:iCs/>
           <w:color w:val="58595B"/>
         </w:rPr>
-        <w:t xml:space="preserve">Τα βήματα 2 και 3 εξαρτώνται από τη ρύθμιση της έκθεσης στο δικό μας σύστημα: κωδικός συναλλαγής, μορφή αρχείου που δέχεται, ονόματα παραμέτρων. Επιβεβαιώστε τα μία φορά με την ομάδα SAP και σημειώστε τα εδώ. Αν η έκθεση ζητά επίπεδο αρχείο αντί για Excel, αποθηκεύστε το φύλλο JOURNAL ENTRIES ως Text (Tab delimited), αφού πρώτα διαγράψετε τις στήλες X και Y.</w:t>
+        <w:t xml:space="preserve">Το βήμα 3 εξαρτάται από τη ρύθμιση της έκθεσης στο δικό μας σύστημα: μορφή αρχείου που δέχεται, ονόματα παραμέτρων. Επιβεβαιώστε το μία φορά με την ομάδα SAP και σημειώστε το εδώ. Αν η έκθεση ζητά επίπεδο αρχείο αντί για Excel, αποθηκεύστε το φύλλο JOURNAL ENTRIES ως Text (Tab delimited), αφού πρώτα διαγράψετε τις στήλες X και Y.</w:t>
       </w:r>
     </w:p>
     <w:p>
@@ -2669,6 +2669,18 @@
     </w:lvlOverride>
   </w:num>
   <w:num w:numId="3">
+    <w:abstractNumId w:val="3"/>
+    <w:lvlOverride w:ilvl="0">
+      <w:startOverride w:val="1"/>
+    </w:lvlOverride>
+  </w:num>
+  <w:num w:numId="4">
+    <w:abstractNumId w:val="3"/>
+    <w:lvlOverride w:ilvl="0">
+      <w:startOverride w:val="1"/>
+    </w:lvlOverride>
+  </w:num>
+  <w:num w:numId="5">
     <w:abstractNumId w:val="3"/>
     <w:lvlOverride w:ilvl="0">
       <w:startOverride w:val="1"/>

</xml_diff>